<commit_message>
Let e-GP create a purchase order after the signed consideration and winner documents, and publish the matching manuals so UAT can run the same flow.
Co-authored-by: Cursor <cursoragent@cursor.com>
</commit_message>
<xml_diff>
--- a/docs/คู่มือการใช้งาน/คู่มือการใช้งาน-ระบบงบประมาณ-1.2.docx
+++ b/docs/คู่มือการใช้งาน/คู่มือการใช้งาน-ระบบงบประมาณ-1.2.docx
@@ -4206,7 +4206,7 @@
           <w:color w:val="2A333A"/>
           <w:sz w:val="24"/>
         </w:rPr>
-        <w:t>เลือกแผนงบประมาณประจำปี และแหล่งเงิน เช่น เงินบำรุง</w:t>
+        <w:t>เลือกประเภทการตั้งงบประมาณ ว่าเป็น ในแผน (สำหรับแผนประจำปีตามปกติ) หรือ นอกแผน (สำหรับกรณีงบในแผนไม่พอและต้องขอตั้งงบเพิ่มเติมเพื่ออนุมัติจัดซื้อต่อไป)</w:t>
       </w:r>
     </w:p>
     <w:p>
@@ -4229,6 +4229,29 @@
           <w:color w:val="2A333A"/>
           <w:sz w:val="24"/>
         </w:rPr>
+        <w:t>เลือกแผนงบประมาณประจำปี และแหล่งเงิน เช่น เงินบำรุง</w:t>
+      </w:r>
+    </w:p>
+    <w:p>
+      <w:pPr>
+        <w:spacing w:after="80"/>
+      </w:pPr>
+      <w:r>
+        <w:rPr>
+          <w:rFonts w:ascii="Prompt" w:hAnsi="Prompt" w:eastAsia="Prompt" w:cs="Prompt"/>
+          <w:b/>
+          <w:color w:val="0B6848"/>
+          <w:sz w:val="24"/>
+        </w:rPr>
+        <w:t xml:space="preserve">ขั้นที่ 6  </w:t>
+      </w:r>
+      <w:r>
+        <w:rPr>
+          <w:rFonts w:ascii="Prompt" w:hAnsi="Prompt" w:eastAsia="Prompt" w:cs="Prompt"/>
+          <w:b w:val="0"/>
+          <w:color w:val="2A333A"/>
+          <w:sz w:val="24"/>
+        </w:rPr>
         <w:t>กรอกรายการในแท็บของแบบฟอร์ม ตามหัวข้อย่อยด้านล่าง</w:t>
       </w:r>
     </w:p>
@@ -4243,7 +4266,7 @@
           <w:color w:val="0B6848"/>
           <w:sz w:val="24"/>
         </w:rPr>
-        <w:t xml:space="preserve">ขั้นที่ 6  </w:t>
+        <w:t xml:space="preserve">ขั้นที่ 7  </w:t>
       </w:r>
       <w:r>
         <w:rPr>
@@ -10025,7 +10048,7 @@
           <w:color w:val="2A333A"/>
           <w:sz w:val="24"/>
         </w:rPr>
-        <w:t>ยอดในใบขอซื้อเกินคงเหลือหรือไม่</w:t>
+        <w:t>ยอดในใบขอซื้อเกินคงเหลือหรือไม่ (หากวงเงินในแผนไม่เพียงพอ ให้สร้างใบคำขอตั้งงบประมาณเพิ่มเติมโดยเลือก ประเภทการตั้งงบประมาณ = นอกแผน ตามบทที่ 4 และส่งให้หน่วยงบประมาณอนุมัติตามบทที่ 5 เพื่อเพิ่มวงเงินเข้าแผนก่อนกลับมาเช็คงบอีกครั้ง)</w:t>
       </w:r>
     </w:p>
     <w:p>

</xml_diff>